<commit_message>
Update gameplan for word.
</commit_message>
<xml_diff>
--- a/1.docx
+++ b/1.docx
@@ -5,7 +5,7 @@
     <w:p>
       <w:pPr>
         <w:rPr>
-          <w:lang w:val="de-DE"/>
+          <w:lang w:val="en-US"/>
         </w:rPr>
       </w:pPr>
     </w:p>
@@ -3908,1505 +3908,185 @@
       </w:r>
       <w:proofErr w:type="spellEnd"/>
     </w:p>
-    <w:p>
-      <w:pPr>
-        <w:rPr>
-          <w:lang w:val="en-GB"/>
-        </w:rPr>
-      </w:pPr>
-    </w:p>
-    <w:p>
-      <w:pPr>
-        <w:rPr>
-          <w:lang w:val="en-GB"/>
-        </w:rPr>
-      </w:pPr>
-      <w:r>
-        <w:rPr>
-          <w:lang w:val="en-GB"/>
-        </w:rPr>
+    <w:p/>
+    <w:p>
+      <w:r>
         <w:t xml:space="preserve">Da bi </w:t>
       </w:r>
       <w:proofErr w:type="spellStart"/>
       <w:r>
-        <w:rPr>
-          <w:lang w:val="en-GB"/>
-        </w:rPr>
         <w:t>poređenje</w:t>
       </w:r>
       <w:proofErr w:type="spellEnd"/>
       <w:r>
-        <w:rPr>
-          <w:lang w:val="en-GB"/>
-        </w:rPr>
-        <w:t xml:space="preserve"> </w:t>
-      </w:r>
-      <w:proofErr w:type="spellStart"/>
-      <w:r>
-        <w:rPr>
-          <w:lang w:val="en-GB"/>
-        </w:rPr>
-        <w:t>imalo</w:t>
-      </w:r>
-      <w:proofErr w:type="spellEnd"/>
-      <w:r>
-        <w:rPr>
-          <w:lang w:val="en-GB"/>
-        </w:rPr>
-        <w:t xml:space="preserve"> </w:t>
-      </w:r>
-      <w:proofErr w:type="spellStart"/>
-      <w:r>
-        <w:rPr>
-          <w:lang w:val="en-GB"/>
-        </w:rPr>
-        <w:t>smisla</w:t>
-      </w:r>
-      <w:proofErr w:type="spellEnd"/>
-      <w:r>
-        <w:rPr>
-          <w:lang w:val="en-GB"/>
-        </w:rPr>
-        <w:t xml:space="preserve"> </w:t>
-      </w:r>
-      <w:proofErr w:type="spellStart"/>
-      <w:r>
-        <w:rPr>
-          <w:lang w:val="en-GB"/>
-        </w:rPr>
-        <w:t>i</w:t>
-      </w:r>
-      <w:proofErr w:type="spellEnd"/>
-      <w:r>
-        <w:rPr>
-          <w:lang w:val="en-GB"/>
-        </w:rPr>
-        <w:t xml:space="preserve"> </w:t>
-      </w:r>
-      <w:proofErr w:type="spellStart"/>
-      <w:r>
-        <w:rPr>
-          <w:lang w:val="en-GB"/>
-        </w:rPr>
-        <w:t>bilo</w:t>
-      </w:r>
-      <w:proofErr w:type="spellEnd"/>
-      <w:r>
-        <w:rPr>
-          <w:lang w:val="en-GB"/>
-        </w:rPr>
-        <w:t xml:space="preserve"> </w:t>
-      </w:r>
-      <w:proofErr w:type="spellStart"/>
-      <w:r>
-        <w:rPr>
-          <w:lang w:val="en-GB"/>
-        </w:rPr>
-        <w:t>akademski</w:t>
-      </w:r>
-      <w:proofErr w:type="spellEnd"/>
-      <w:r>
-        <w:rPr>
-          <w:lang w:val="en-GB"/>
-        </w:rPr>
-        <w:t xml:space="preserve"> </w:t>
-      </w:r>
-      <w:proofErr w:type="spellStart"/>
-      <w:r>
-        <w:rPr>
-          <w:lang w:val="en-GB"/>
-        </w:rPr>
-        <w:t>validno</w:t>
-      </w:r>
-      <w:proofErr w:type="spellEnd"/>
-      <w:r>
-        <w:rPr>
-          <w:lang w:val="en-GB"/>
-        </w:rPr>
+        <w:t xml:space="preserve"> imalo smisla i bilo akademski validno, obje </w:t>
+      </w:r>
+      <w:proofErr w:type="spellStart"/>
+      <w:r>
+        <w:t>neuralne</w:t>
+      </w:r>
+      <w:proofErr w:type="spellEnd"/>
+      <w:r>
+        <w:t xml:space="preserve"> mreže su implementirane na isti način u </w:t>
+      </w:r>
+      <w:proofErr w:type="spellStart"/>
+      <w:r>
+        <w:t>Python</w:t>
+      </w:r>
+      <w:proofErr w:type="spellEnd"/>
+      <w:r>
+        <w:t xml:space="preserve"> i .NET </w:t>
+      </w:r>
+      <w:proofErr w:type="spellStart"/>
+      <w:r>
+        <w:t>okruženjima</w:t>
+      </w:r>
+      <w:proofErr w:type="spellEnd"/>
+      <w:r>
+        <w:t xml:space="preserve">. Sastoji se od </w:t>
+      </w:r>
+      <w:proofErr w:type="spellStart"/>
+      <w:r>
+        <w:t>konvolucijskih</w:t>
+      </w:r>
+      <w:proofErr w:type="spellEnd"/>
+      <w:r>
         <w:t xml:space="preserve">, </w:t>
       </w:r>
       <w:proofErr w:type="spellStart"/>
       <w:r>
-        <w:rPr>
-          <w:lang w:val="en-GB"/>
-        </w:rPr>
-        <w:t>obje</w:t>
-      </w:r>
-      <w:proofErr w:type="spellEnd"/>
-      <w:r>
-        <w:rPr>
-          <w:lang w:val="en-GB"/>
-        </w:rPr>
-        <w:t xml:space="preserve"> </w:t>
-      </w:r>
-      <w:proofErr w:type="spellStart"/>
-      <w:r>
-        <w:rPr>
-          <w:lang w:val="en-GB"/>
-        </w:rPr>
-        <w:t>neuralne</w:t>
-      </w:r>
-      <w:proofErr w:type="spellEnd"/>
-      <w:r>
-        <w:rPr>
-          <w:lang w:val="en-GB"/>
-        </w:rPr>
-        <w:t xml:space="preserve"> </w:t>
-      </w:r>
-      <w:proofErr w:type="spellStart"/>
-      <w:r>
-        <w:rPr>
-          <w:lang w:val="en-GB"/>
-        </w:rPr>
-        <w:t>mreže</w:t>
-      </w:r>
-      <w:proofErr w:type="spellEnd"/>
-      <w:r>
-        <w:rPr>
-          <w:lang w:val="en-GB"/>
-        </w:rPr>
-        <w:t xml:space="preserve"> </w:t>
-      </w:r>
-      <w:proofErr w:type="spellStart"/>
-      <w:r>
-        <w:rPr>
-          <w:lang w:val="en-GB"/>
-        </w:rPr>
-        <w:t>su</w:t>
-      </w:r>
-      <w:proofErr w:type="spellEnd"/>
-      <w:r>
-        <w:rPr>
-          <w:lang w:val="en-GB"/>
-        </w:rPr>
-        <w:t xml:space="preserve"> </w:t>
-      </w:r>
-      <w:proofErr w:type="spellStart"/>
-      <w:r>
-        <w:rPr>
-          <w:lang w:val="en-GB"/>
-        </w:rPr>
-        <w:t>implementirane</w:t>
-      </w:r>
-      <w:proofErr w:type="spellEnd"/>
-      <w:r>
-        <w:rPr>
-          <w:lang w:val="en-GB"/>
-        </w:rPr>
-        <w:t xml:space="preserve"> </w:t>
-      </w:r>
-      <w:proofErr w:type="spellStart"/>
-      <w:r>
-        <w:rPr>
-          <w:lang w:val="en-GB"/>
-        </w:rPr>
-        <w:t>na</w:t>
-      </w:r>
-      <w:proofErr w:type="spellEnd"/>
-      <w:r>
-        <w:rPr>
-          <w:lang w:val="en-GB"/>
-        </w:rPr>
-        <w:t xml:space="preserve"> </w:t>
-      </w:r>
-      <w:proofErr w:type="spellStart"/>
-      <w:r>
-        <w:rPr>
-          <w:lang w:val="en-GB"/>
-        </w:rPr>
-        <w:t>isti</w:t>
-      </w:r>
-      <w:proofErr w:type="spellEnd"/>
-      <w:r>
-        <w:rPr>
-          <w:lang w:val="en-GB"/>
-        </w:rPr>
-        <w:t xml:space="preserve"> </w:t>
-      </w:r>
-      <w:proofErr w:type="spellStart"/>
-      <w:r>
-        <w:rPr>
-          <w:lang w:val="en-GB"/>
-        </w:rPr>
-        <w:t>način</w:t>
-      </w:r>
-      <w:proofErr w:type="spellEnd"/>
-      <w:r>
-        <w:rPr>
-          <w:lang w:val="en-GB"/>
-        </w:rPr>
-        <w:t xml:space="preserve"> u Python </w:t>
-      </w:r>
-      <w:proofErr w:type="spellStart"/>
-      <w:r>
-        <w:rPr>
-          <w:lang w:val="en-GB"/>
-        </w:rPr>
-        <w:t>i</w:t>
-      </w:r>
-      <w:proofErr w:type="spellEnd"/>
-      <w:r>
-        <w:rPr>
-          <w:lang w:val="en-GB"/>
-        </w:rPr>
-        <w:t xml:space="preserve"> .NET </w:t>
-      </w:r>
-      <w:proofErr w:type="spellStart"/>
-      <w:r>
-        <w:rPr>
-          <w:lang w:val="en-GB"/>
-        </w:rPr>
-        <w:t>okruženjima</w:t>
-      </w:r>
-      <w:proofErr w:type="spellEnd"/>
-      <w:r>
-        <w:rPr>
-          <w:lang w:val="en-GB"/>
-        </w:rPr>
-        <w:t xml:space="preserve">. </w:t>
-      </w:r>
-      <w:proofErr w:type="spellStart"/>
-      <w:r>
-        <w:rPr>
-          <w:lang w:val="en-GB"/>
-        </w:rPr>
-        <w:t>Sastoji</w:t>
-      </w:r>
-      <w:proofErr w:type="spellEnd"/>
-      <w:r>
-        <w:rPr>
-          <w:lang w:val="en-GB"/>
-        </w:rPr>
-        <w:t xml:space="preserve"> se od </w:t>
-      </w:r>
-      <w:proofErr w:type="spellStart"/>
-      <w:r>
-        <w:rPr>
-          <w:lang w:val="en-GB"/>
-        </w:rPr>
-        <w:t>konvolucijskih</w:t>
-      </w:r>
-      <w:proofErr w:type="spellEnd"/>
-      <w:r>
-        <w:rPr>
-          <w:lang w:val="en-GB"/>
-        </w:rPr>
-        <w:t xml:space="preserve">, pooling, </w:t>
-      </w:r>
-      <w:proofErr w:type="spellStart"/>
-      <w:r>
-        <w:rPr>
-          <w:lang w:val="en-GB"/>
-        </w:rPr>
-        <w:t>aktivacijskih</w:t>
-      </w:r>
-      <w:proofErr w:type="spellEnd"/>
-      <w:r>
-        <w:rPr>
-          <w:lang w:val="en-GB"/>
-        </w:rPr>
-        <w:t xml:space="preserve"> </w:t>
-      </w:r>
-      <w:proofErr w:type="spellStart"/>
-      <w:r>
-        <w:rPr>
-          <w:lang w:val="en-GB"/>
-        </w:rPr>
-        <w:t>i</w:t>
-      </w:r>
-      <w:proofErr w:type="spellEnd"/>
-      <w:r>
-        <w:rPr>
-          <w:lang w:val="en-GB"/>
-        </w:rPr>
-        <w:t xml:space="preserve"> </w:t>
-      </w:r>
-      <w:proofErr w:type="spellStart"/>
-      <w:r>
-        <w:rPr>
-          <w:lang w:val="en-GB"/>
-        </w:rPr>
-        <w:t>potpuno</w:t>
-      </w:r>
-      <w:proofErr w:type="spellEnd"/>
-      <w:r>
-        <w:rPr>
-          <w:lang w:val="en-GB"/>
-        </w:rPr>
-        <w:t xml:space="preserve"> </w:t>
-      </w:r>
-      <w:proofErr w:type="spellStart"/>
-      <w:r>
-        <w:rPr>
-          <w:lang w:val="en-GB"/>
-        </w:rPr>
-        <w:t>povezanih</w:t>
-      </w:r>
-      <w:proofErr w:type="spellEnd"/>
-      <w:r>
-        <w:rPr>
-          <w:lang w:val="en-GB"/>
-        </w:rPr>
-        <w:t xml:space="preserve"> </w:t>
-      </w:r>
-      <w:proofErr w:type="spellStart"/>
-      <w:r>
-        <w:rPr>
-          <w:lang w:val="en-GB"/>
-        </w:rPr>
-        <w:t>slojeva</w:t>
-      </w:r>
-      <w:proofErr w:type="spellEnd"/>
-      <w:r>
-        <w:rPr>
-          <w:lang w:val="en-GB"/>
-        </w:rPr>
-        <w:t xml:space="preserve">. </w:t>
-      </w:r>
-    </w:p>
-    <w:p>
-      <w:pPr>
-        <w:rPr>
-          <w:lang w:val="en-GB"/>
-        </w:rPr>
-      </w:pPr>
-      <w:r>
-        <w:rPr>
-          <w:lang w:val="en-GB"/>
-        </w:rPr>
-        <w:t xml:space="preserve">Pored </w:t>
-      </w:r>
-      <w:proofErr w:type="spellStart"/>
-      <w:r>
-        <w:rPr>
-          <w:lang w:val="en-GB"/>
-        </w:rPr>
-        <w:t>navedenih</w:t>
-      </w:r>
-      <w:proofErr w:type="spellEnd"/>
-      <w:r>
-        <w:rPr>
-          <w:lang w:val="en-GB"/>
-        </w:rPr>
+        <w:t>pooling</w:t>
+      </w:r>
+      <w:proofErr w:type="spellEnd"/>
+      <w:r>
+        <w:t xml:space="preserve">, aktivacijskih i potpuno povezanih slojeva. </w:t>
+      </w:r>
+    </w:p>
+    <w:p>
+      <w:r>
+        <w:t xml:space="preserve">Pored navedenih, koristi se </w:t>
+      </w:r>
+      <w:proofErr w:type="spellStart"/>
+      <w:r>
+        <w:t>Flatten</w:t>
+      </w:r>
+      <w:proofErr w:type="spellEnd"/>
+      <w:r>
+        <w:t xml:space="preserve"> sloj</w:t>
+      </w:r>
+      <w:r>
+        <w:t xml:space="preserve"> </w:t>
+      </w:r>
+      <w:r>
+        <w:t xml:space="preserve">(sloj ispravljanja). Dati sloj uzima podatak iz više dimenzija recimo sliku koja je u 2D iz </w:t>
+      </w:r>
+      <w:r>
+        <w:t xml:space="preserve">prethodnih </w:t>
+      </w:r>
+      <w:r>
+        <w:t xml:space="preserve">slojeva i pretvori je 1D niz. Ovaj sloj nam je potreban između </w:t>
+      </w:r>
+      <w:proofErr w:type="spellStart"/>
+      <w:r>
+        <w:t>konvolucijskog</w:t>
+      </w:r>
+      <w:proofErr w:type="spellEnd"/>
+      <w:r>
+        <w:t xml:space="preserve"> dijela mreže koji radi sa </w:t>
+      </w:r>
+      <w:proofErr w:type="spellStart"/>
+      <w:r>
+        <w:t>matricima</w:t>
+      </w:r>
+      <w:proofErr w:type="spellEnd"/>
+      <w:r>
+        <w:t xml:space="preserve"> i </w:t>
+      </w:r>
+      <w:r>
+        <w:t xml:space="preserve">potpuno </w:t>
+      </w:r>
+      <w:r>
+        <w:t>povezanog dijela koji radi sa 1D ulazima.</w:t>
+      </w:r>
+    </w:p>
+    <w:p>
+      <w:r>
+        <w:t xml:space="preserve">Također, prilikom prolaska kroz prvi </w:t>
+      </w:r>
+      <w:proofErr w:type="spellStart"/>
+      <w:r>
+        <w:t>kovolucijskog</w:t>
+      </w:r>
+      <w:proofErr w:type="spellEnd"/>
+      <w:r>
+        <w:t xml:space="preserve"> sloj slika se transformiše iz jednog u 64. kanala. Ovo nam u biti daje 64 različite </w:t>
+      </w:r>
+      <w:proofErr w:type="spellStart"/>
+      <w:r>
+        <w:t>transformisane</w:t>
+      </w:r>
+      <w:proofErr w:type="spellEnd"/>
+      <w:r>
+        <w:t xml:space="preserve"> </w:t>
+      </w:r>
+      <w:r>
+        <w:t xml:space="preserve">slike. Cilj ovoga jeste da </w:t>
+      </w:r>
+      <w:proofErr w:type="spellStart"/>
+      <w:r>
+        <w:t>povećavanje</w:t>
+      </w:r>
+      <w:proofErr w:type="spellEnd"/>
+      <w:r>
+        <w:t xml:space="preserve"> broj</w:t>
+      </w:r>
+      <w:r>
+        <w:t>a</w:t>
+      </w:r>
+      <w:r>
+        <w:t xml:space="preserve"> </w:t>
+      </w:r>
+      <w:proofErr w:type="spellStart"/>
+      <w:r>
+        <w:t>kernela</w:t>
+      </w:r>
+      <w:proofErr w:type="spellEnd"/>
+      <w:r>
         <w:t xml:space="preserve">, </w:t>
       </w:r>
-      <w:proofErr w:type="spellStart"/>
-      <w:r>
-        <w:rPr>
-          <w:lang w:val="en-GB"/>
-        </w:rPr>
-        <w:t>koristi</w:t>
-      </w:r>
-      <w:proofErr w:type="spellEnd"/>
-      <w:r>
-        <w:rPr>
-          <w:lang w:val="en-GB"/>
-        </w:rPr>
-        <w:t xml:space="preserve"> se Flatten </w:t>
-      </w:r>
-      <w:proofErr w:type="spellStart"/>
-      <w:r>
-        <w:rPr>
-          <w:lang w:val="en-GB"/>
-        </w:rPr>
-        <w:t>sloj</w:t>
-      </w:r>
-      <w:proofErr w:type="spellEnd"/>
-      <w:r>
-        <w:rPr>
-          <w:lang w:val="en-GB"/>
-        </w:rPr>
-        <w:t xml:space="preserve"> </w:t>
-      </w:r>
-      <w:r>
-        <w:rPr>
-          <w:lang w:val="en-GB"/>
-        </w:rPr>
-        <w:t>(</w:t>
-      </w:r>
-      <w:proofErr w:type="spellStart"/>
-      <w:r>
-        <w:rPr>
-          <w:lang w:val="en-GB"/>
-        </w:rPr>
-        <w:t>sloj</w:t>
-      </w:r>
-      <w:proofErr w:type="spellEnd"/>
-      <w:r>
-        <w:rPr>
-          <w:lang w:val="en-GB"/>
-        </w:rPr>
-        <w:t xml:space="preserve"> </w:t>
-      </w:r>
-      <w:proofErr w:type="spellStart"/>
-      <w:r>
-        <w:rPr>
-          <w:lang w:val="en-GB"/>
-        </w:rPr>
-        <w:t>ispravljanja</w:t>
-      </w:r>
-      <w:proofErr w:type="spellEnd"/>
-      <w:r>
-        <w:rPr>
-          <w:lang w:val="en-GB"/>
-        </w:rPr>
-        <w:t xml:space="preserve">). Dati </w:t>
-      </w:r>
-      <w:proofErr w:type="spellStart"/>
-      <w:r>
-        <w:rPr>
-          <w:lang w:val="en-GB"/>
-        </w:rPr>
-        <w:t>sloj</w:t>
-      </w:r>
-      <w:proofErr w:type="spellEnd"/>
-      <w:r>
-        <w:rPr>
-          <w:lang w:val="en-GB"/>
-        </w:rPr>
-        <w:t xml:space="preserve"> </w:t>
-      </w:r>
-      <w:proofErr w:type="spellStart"/>
-      <w:r>
-        <w:rPr>
-          <w:lang w:val="en-GB"/>
-        </w:rPr>
-        <w:t>uzima</w:t>
-      </w:r>
-      <w:proofErr w:type="spellEnd"/>
-      <w:r>
-        <w:rPr>
-          <w:lang w:val="en-GB"/>
-        </w:rPr>
-        <w:t xml:space="preserve"> </w:t>
-      </w:r>
-      <w:proofErr w:type="spellStart"/>
-      <w:r>
-        <w:rPr>
-          <w:lang w:val="en-GB"/>
-        </w:rPr>
-        <w:t>podatak</w:t>
-      </w:r>
-      <w:proofErr w:type="spellEnd"/>
-      <w:r>
-        <w:rPr>
-          <w:lang w:val="en-GB"/>
-        </w:rPr>
-        <w:t xml:space="preserve"> </w:t>
-      </w:r>
-      <w:proofErr w:type="spellStart"/>
-      <w:r>
-        <w:rPr>
-          <w:lang w:val="en-GB"/>
-        </w:rPr>
-        <w:t>iz</w:t>
-      </w:r>
-      <w:proofErr w:type="spellEnd"/>
-      <w:r>
-        <w:rPr>
-          <w:lang w:val="en-GB"/>
-        </w:rPr>
-        <w:t xml:space="preserve"> </w:t>
-      </w:r>
-      <w:proofErr w:type="spellStart"/>
-      <w:r>
-        <w:rPr>
-          <w:lang w:val="en-GB"/>
-        </w:rPr>
-        <w:t>više</w:t>
-      </w:r>
-      <w:proofErr w:type="spellEnd"/>
-      <w:r>
-        <w:rPr>
-          <w:lang w:val="en-GB"/>
-        </w:rPr>
-        <w:t xml:space="preserve"> </w:t>
-      </w:r>
-      <w:proofErr w:type="spellStart"/>
-      <w:r>
-        <w:rPr>
-          <w:lang w:val="en-GB"/>
-        </w:rPr>
-        <w:t>dimenzija</w:t>
-      </w:r>
-      <w:proofErr w:type="spellEnd"/>
-      <w:r>
-        <w:rPr>
-          <w:lang w:val="en-GB"/>
-        </w:rPr>
-        <w:t xml:space="preserve"> </w:t>
-      </w:r>
-      <w:proofErr w:type="spellStart"/>
-      <w:r>
-        <w:rPr>
-          <w:lang w:val="en-GB"/>
-        </w:rPr>
-        <w:t>recimo</w:t>
-      </w:r>
-      <w:proofErr w:type="spellEnd"/>
-      <w:r>
-        <w:rPr>
-          <w:lang w:val="en-GB"/>
-        </w:rPr>
-        <w:t xml:space="preserve"> </w:t>
-      </w:r>
-      <w:proofErr w:type="spellStart"/>
-      <w:r>
-        <w:rPr>
-          <w:lang w:val="en-GB"/>
-        </w:rPr>
-        <w:t>sliku</w:t>
-      </w:r>
-      <w:proofErr w:type="spellEnd"/>
-      <w:r>
-        <w:rPr>
-          <w:lang w:val="en-GB"/>
-        </w:rPr>
-        <w:t xml:space="preserve"> </w:t>
-      </w:r>
-      <w:proofErr w:type="spellStart"/>
-      <w:r>
-        <w:rPr>
-          <w:lang w:val="en-GB"/>
-        </w:rPr>
-        <w:t>koja</w:t>
-      </w:r>
-      <w:proofErr w:type="spellEnd"/>
-      <w:r>
-        <w:rPr>
-          <w:lang w:val="en-GB"/>
-        </w:rPr>
-        <w:t xml:space="preserve"> je u 2D </w:t>
-      </w:r>
-      <w:proofErr w:type="spellStart"/>
-      <w:r>
-        <w:rPr>
-          <w:lang w:val="en-GB"/>
-        </w:rPr>
-        <w:t>iz</w:t>
-      </w:r>
-      <w:proofErr w:type="spellEnd"/>
-      <w:r>
-        <w:rPr>
-          <w:lang w:val="en-GB"/>
-        </w:rPr>
-        <w:t xml:space="preserve"> </w:t>
-      </w:r>
-      <w:proofErr w:type="spellStart"/>
-      <w:r>
-        <w:rPr>
-          <w:lang w:val="en-GB"/>
-        </w:rPr>
-        <w:t>prethodnih</w:t>
-      </w:r>
-      <w:proofErr w:type="spellEnd"/>
-      <w:r>
-        <w:rPr>
-          <w:lang w:val="en-GB"/>
-        </w:rPr>
-        <w:t xml:space="preserve"> </w:t>
-      </w:r>
-      <w:proofErr w:type="spellStart"/>
-      <w:r>
-        <w:rPr>
-          <w:lang w:val="en-GB"/>
-        </w:rPr>
-        <w:t>slojeva</w:t>
-      </w:r>
-      <w:proofErr w:type="spellEnd"/>
-      <w:r>
-        <w:rPr>
-          <w:lang w:val="en-GB"/>
-        </w:rPr>
-        <w:t xml:space="preserve"> </w:t>
-      </w:r>
-      <w:proofErr w:type="spellStart"/>
-      <w:r>
-        <w:rPr>
-          <w:lang w:val="en-GB"/>
-        </w:rPr>
-        <w:t>i</w:t>
-      </w:r>
-      <w:proofErr w:type="spellEnd"/>
-      <w:r>
-        <w:rPr>
-          <w:lang w:val="en-GB"/>
-        </w:rPr>
-        <w:t xml:space="preserve"> </w:t>
-      </w:r>
-      <w:proofErr w:type="spellStart"/>
-      <w:r>
-        <w:rPr>
-          <w:lang w:val="en-GB"/>
-        </w:rPr>
-        <w:t>pretvori</w:t>
-      </w:r>
-      <w:proofErr w:type="spellEnd"/>
-      <w:r>
-        <w:rPr>
-          <w:lang w:val="en-GB"/>
-        </w:rPr>
-        <w:t xml:space="preserve"> je 1D </w:t>
-      </w:r>
-      <w:proofErr w:type="spellStart"/>
-      <w:r>
-        <w:rPr>
-          <w:lang w:val="en-GB"/>
-        </w:rPr>
-        <w:t>niz</w:t>
-      </w:r>
-      <w:proofErr w:type="spellEnd"/>
-      <w:r>
-        <w:rPr>
-          <w:lang w:val="en-GB"/>
-        </w:rPr>
-        <w:t xml:space="preserve">. </w:t>
-      </w:r>
-      <w:proofErr w:type="spellStart"/>
-      <w:r>
-        <w:rPr>
-          <w:lang w:val="en-GB"/>
-        </w:rPr>
-        <w:t>Ovaj</w:t>
-      </w:r>
-      <w:proofErr w:type="spellEnd"/>
-      <w:r>
-        <w:rPr>
-          <w:lang w:val="en-GB"/>
-        </w:rPr>
-        <w:t xml:space="preserve"> </w:t>
-      </w:r>
-      <w:proofErr w:type="spellStart"/>
-      <w:r>
-        <w:rPr>
-          <w:lang w:val="en-GB"/>
-        </w:rPr>
-        <w:t>sloj</w:t>
-      </w:r>
-      <w:proofErr w:type="spellEnd"/>
-      <w:r>
-        <w:rPr>
-          <w:lang w:val="en-GB"/>
-        </w:rPr>
-        <w:t xml:space="preserve"> </w:t>
-      </w:r>
-      <w:proofErr w:type="spellStart"/>
-      <w:r>
-        <w:rPr>
-          <w:lang w:val="en-GB"/>
-        </w:rPr>
-        <w:t>nam</w:t>
-      </w:r>
-      <w:proofErr w:type="spellEnd"/>
-      <w:r>
-        <w:rPr>
-          <w:lang w:val="en-GB"/>
-        </w:rPr>
-        <w:t xml:space="preserve"> je </w:t>
-      </w:r>
-      <w:proofErr w:type="spellStart"/>
-      <w:r>
-        <w:rPr>
-          <w:lang w:val="en-GB"/>
-        </w:rPr>
-        <w:t>potreban</w:t>
-      </w:r>
-      <w:proofErr w:type="spellEnd"/>
-      <w:r>
-        <w:rPr>
-          <w:lang w:val="en-GB"/>
-        </w:rPr>
-        <w:t xml:space="preserve"> </w:t>
-      </w:r>
-      <w:proofErr w:type="spellStart"/>
-      <w:r>
-        <w:rPr>
-          <w:lang w:val="en-GB"/>
-        </w:rPr>
-        <w:t>između</w:t>
-      </w:r>
-      <w:proofErr w:type="spellEnd"/>
-      <w:r>
-        <w:rPr>
-          <w:lang w:val="en-GB"/>
-        </w:rPr>
-        <w:t xml:space="preserve"> </w:t>
-      </w:r>
-      <w:proofErr w:type="spellStart"/>
-      <w:r>
-        <w:rPr>
-          <w:lang w:val="en-GB"/>
-        </w:rPr>
-        <w:t>konvolucijskog</w:t>
-      </w:r>
-      <w:proofErr w:type="spellEnd"/>
-      <w:r>
-        <w:rPr>
-          <w:lang w:val="en-GB"/>
-        </w:rPr>
-        <w:t xml:space="preserve"> </w:t>
-      </w:r>
-      <w:proofErr w:type="spellStart"/>
-      <w:r>
-        <w:rPr>
-          <w:lang w:val="en-GB"/>
-        </w:rPr>
-        <w:t>dijela</w:t>
-      </w:r>
-      <w:proofErr w:type="spellEnd"/>
-      <w:r>
-        <w:rPr>
-          <w:lang w:val="en-GB"/>
-        </w:rPr>
-        <w:t xml:space="preserve"> </w:t>
-      </w:r>
-      <w:proofErr w:type="spellStart"/>
-      <w:r>
-        <w:rPr>
-          <w:lang w:val="en-GB"/>
-        </w:rPr>
-        <w:t>mreže</w:t>
-      </w:r>
-      <w:proofErr w:type="spellEnd"/>
-      <w:r>
-        <w:rPr>
-          <w:lang w:val="en-GB"/>
-        </w:rPr>
-        <w:t xml:space="preserve"> koji </w:t>
-      </w:r>
-      <w:proofErr w:type="spellStart"/>
-      <w:r>
-        <w:rPr>
-          <w:lang w:val="en-GB"/>
-        </w:rPr>
-        <w:t>radi</w:t>
-      </w:r>
-      <w:proofErr w:type="spellEnd"/>
-      <w:r>
-        <w:rPr>
-          <w:lang w:val="en-GB"/>
-        </w:rPr>
-        <w:t xml:space="preserve"> </w:t>
-      </w:r>
-      <w:proofErr w:type="spellStart"/>
-      <w:r>
-        <w:rPr>
-          <w:lang w:val="en-GB"/>
-        </w:rPr>
-        <w:t>sa</w:t>
-      </w:r>
-      <w:proofErr w:type="spellEnd"/>
-      <w:r>
-        <w:rPr>
-          <w:lang w:val="en-GB"/>
-        </w:rPr>
-        <w:t xml:space="preserve"> </w:t>
-      </w:r>
-      <w:proofErr w:type="spellStart"/>
-      <w:r>
-        <w:rPr>
-          <w:lang w:val="en-GB"/>
-        </w:rPr>
-        <w:t>matricima</w:t>
-      </w:r>
-      <w:proofErr w:type="spellEnd"/>
-      <w:r>
-        <w:rPr>
-          <w:lang w:val="en-GB"/>
-        </w:rPr>
-        <w:t xml:space="preserve"> </w:t>
-      </w:r>
-      <w:proofErr w:type="spellStart"/>
-      <w:r>
-        <w:rPr>
-          <w:lang w:val="en-GB"/>
-        </w:rPr>
-        <w:t>i</w:t>
-      </w:r>
-      <w:proofErr w:type="spellEnd"/>
-      <w:r>
-        <w:rPr>
-          <w:lang w:val="en-GB"/>
-        </w:rPr>
-        <w:t xml:space="preserve"> </w:t>
-      </w:r>
-      <w:proofErr w:type="spellStart"/>
-      <w:r>
-        <w:rPr>
-          <w:lang w:val="en-GB"/>
-        </w:rPr>
-        <w:t>potpuno</w:t>
-      </w:r>
-      <w:proofErr w:type="spellEnd"/>
-      <w:r>
-        <w:rPr>
-          <w:lang w:val="en-GB"/>
-        </w:rPr>
-        <w:t xml:space="preserve"> </w:t>
-      </w:r>
-      <w:proofErr w:type="spellStart"/>
-      <w:r>
-        <w:rPr>
-          <w:lang w:val="en-GB"/>
-        </w:rPr>
-        <w:t>povezanog</w:t>
-      </w:r>
-      <w:proofErr w:type="spellEnd"/>
-      <w:r>
-        <w:rPr>
-          <w:lang w:val="en-GB"/>
-        </w:rPr>
-        <w:t xml:space="preserve"> </w:t>
-      </w:r>
-      <w:proofErr w:type="spellStart"/>
-      <w:r>
-        <w:rPr>
-          <w:lang w:val="en-GB"/>
-        </w:rPr>
-        <w:t>dijela</w:t>
-      </w:r>
-      <w:proofErr w:type="spellEnd"/>
-      <w:r>
-        <w:rPr>
-          <w:lang w:val="en-GB"/>
-        </w:rPr>
-        <w:t xml:space="preserve"> koji </w:t>
-      </w:r>
-      <w:proofErr w:type="spellStart"/>
-      <w:r>
-        <w:rPr>
-          <w:lang w:val="en-GB"/>
-        </w:rPr>
-        <w:t>radi</w:t>
-      </w:r>
-      <w:proofErr w:type="spellEnd"/>
-      <w:r>
-        <w:rPr>
-          <w:lang w:val="en-GB"/>
-        </w:rPr>
-        <w:t xml:space="preserve"> </w:t>
-      </w:r>
-      <w:proofErr w:type="spellStart"/>
-      <w:r>
-        <w:rPr>
-          <w:lang w:val="en-GB"/>
-        </w:rPr>
-        <w:t>sa</w:t>
-      </w:r>
-      <w:proofErr w:type="spellEnd"/>
-      <w:r>
-        <w:rPr>
-          <w:lang w:val="en-GB"/>
-        </w:rPr>
-        <w:t xml:space="preserve"> 1D </w:t>
-      </w:r>
-      <w:proofErr w:type="spellStart"/>
-      <w:r>
-        <w:rPr>
-          <w:lang w:val="en-GB"/>
-        </w:rPr>
-        <w:t>ulazima</w:t>
-      </w:r>
-      <w:proofErr w:type="spellEnd"/>
-      <w:r>
-        <w:rPr>
-          <w:lang w:val="en-GB"/>
-        </w:rPr>
+      <w:r>
+        <w:t xml:space="preserve">samim time </w:t>
+      </w:r>
+      <w:proofErr w:type="spellStart"/>
+      <w:r>
+        <w:t>omogućavanje</w:t>
+      </w:r>
+      <w:proofErr w:type="spellEnd"/>
+      <w:r>
+        <w:t xml:space="preserve"> prepoznavanje više oblika recimo jedan </w:t>
+      </w:r>
+      <w:proofErr w:type="spellStart"/>
+      <w:r>
+        <w:t>kernel</w:t>
+      </w:r>
+      <w:proofErr w:type="spellEnd"/>
+      <w:r>
+        <w:t xml:space="preserve"> će tražiti vertikal</w:t>
+      </w:r>
+      <w:r>
+        <w:t xml:space="preserve">ne linije, drugi </w:t>
+      </w:r>
+      <w:r>
+        <w:t>horizontalne linije</w:t>
+      </w:r>
+      <w:r>
+        <w:t xml:space="preserve"> te treći krugove</w:t>
+      </w:r>
+      <w:r>
         <w:t>.</w:t>
       </w:r>
     </w:p>
-    <w:p>
-      <w:pPr>
-        <w:rPr>
-          <w:lang w:val="en-GB"/>
-        </w:rPr>
-      </w:pPr>
-      <w:r>
-        <w:rPr>
-          <w:lang w:val="en-GB"/>
-        </w:rPr>
-        <w:t xml:space="preserve">Također, </w:t>
-      </w:r>
-      <w:proofErr w:type="spellStart"/>
-      <w:r>
-        <w:rPr>
-          <w:lang w:val="en-GB"/>
-        </w:rPr>
-        <w:t>prilikom</w:t>
-      </w:r>
-      <w:proofErr w:type="spellEnd"/>
-      <w:r>
-        <w:rPr>
-          <w:lang w:val="en-GB"/>
-        </w:rPr>
-        <w:t xml:space="preserve"> </w:t>
-      </w:r>
-      <w:proofErr w:type="spellStart"/>
-      <w:r>
-        <w:rPr>
-          <w:lang w:val="en-GB"/>
-        </w:rPr>
-        <w:t>prolaska</w:t>
-      </w:r>
-      <w:proofErr w:type="spellEnd"/>
-      <w:r>
-        <w:rPr>
-          <w:lang w:val="en-GB"/>
-        </w:rPr>
-        <w:t xml:space="preserve"> </w:t>
-      </w:r>
-      <w:proofErr w:type="spellStart"/>
-      <w:r>
-        <w:rPr>
-          <w:lang w:val="en-GB"/>
-        </w:rPr>
-        <w:t>kroz</w:t>
-      </w:r>
-      <w:proofErr w:type="spellEnd"/>
-      <w:r>
-        <w:rPr>
-          <w:lang w:val="en-GB"/>
-        </w:rPr>
-        <w:t xml:space="preserve"> </w:t>
-      </w:r>
-      <w:proofErr w:type="spellStart"/>
-      <w:r>
-        <w:rPr>
-          <w:lang w:val="en-GB"/>
-        </w:rPr>
-        <w:t>prvi</w:t>
-      </w:r>
-      <w:proofErr w:type="spellEnd"/>
-      <w:r>
-        <w:rPr>
-          <w:lang w:val="en-GB"/>
-        </w:rPr>
-        <w:t xml:space="preserve"> </w:t>
-      </w:r>
-      <w:proofErr w:type="spellStart"/>
-      <w:r>
-        <w:rPr>
-          <w:lang w:val="en-GB"/>
-        </w:rPr>
-        <w:t>kovolucijskog</w:t>
-      </w:r>
-      <w:proofErr w:type="spellEnd"/>
-      <w:r>
-        <w:rPr>
-          <w:lang w:val="en-GB"/>
-        </w:rPr>
-        <w:t xml:space="preserve"> </w:t>
-      </w:r>
-      <w:proofErr w:type="spellStart"/>
-      <w:r>
-        <w:rPr>
-          <w:lang w:val="en-GB"/>
-        </w:rPr>
-        <w:t>sloj</w:t>
-      </w:r>
-      <w:proofErr w:type="spellEnd"/>
-      <w:r>
-        <w:rPr>
-          <w:lang w:val="en-GB"/>
-        </w:rPr>
-        <w:t xml:space="preserve"> </w:t>
-      </w:r>
-      <w:proofErr w:type="spellStart"/>
-      <w:r>
-        <w:rPr>
-          <w:lang w:val="en-GB"/>
-        </w:rPr>
-        <w:t>slika</w:t>
-      </w:r>
-      <w:proofErr w:type="spellEnd"/>
-      <w:r>
-        <w:rPr>
-          <w:lang w:val="en-GB"/>
-        </w:rPr>
-        <w:t xml:space="preserve"> se </w:t>
-      </w:r>
-      <w:proofErr w:type="spellStart"/>
-      <w:r>
-        <w:rPr>
-          <w:lang w:val="en-GB"/>
-        </w:rPr>
-        <w:t>transformiše</w:t>
-      </w:r>
-      <w:proofErr w:type="spellEnd"/>
-      <w:r>
-        <w:rPr>
-          <w:lang w:val="en-GB"/>
-        </w:rPr>
-        <w:t xml:space="preserve"> </w:t>
-      </w:r>
-      <w:proofErr w:type="spellStart"/>
-      <w:r>
-        <w:rPr>
-          <w:lang w:val="en-GB"/>
-        </w:rPr>
-        <w:t>iz</w:t>
-      </w:r>
-      <w:proofErr w:type="spellEnd"/>
-      <w:r>
-        <w:rPr>
-          <w:lang w:val="en-GB"/>
-        </w:rPr>
-        <w:t xml:space="preserve"> </w:t>
-      </w:r>
-      <w:proofErr w:type="spellStart"/>
-      <w:r>
-        <w:rPr>
-          <w:lang w:val="en-GB"/>
-        </w:rPr>
-        <w:t>jednog</w:t>
-      </w:r>
-      <w:proofErr w:type="spellEnd"/>
-      <w:r>
-        <w:rPr>
-          <w:lang w:val="en-GB"/>
-        </w:rPr>
-        <w:t xml:space="preserve"> u 64. </w:t>
-      </w:r>
-      <w:proofErr w:type="spellStart"/>
-      <w:r>
-        <w:rPr>
-          <w:lang w:val="en-GB"/>
-        </w:rPr>
-        <w:t>kanala</w:t>
-      </w:r>
-      <w:proofErr w:type="spellEnd"/>
-      <w:r>
-        <w:rPr>
-          <w:lang w:val="en-GB"/>
-        </w:rPr>
-        <w:t xml:space="preserve">. Ovo </w:t>
-      </w:r>
-      <w:proofErr w:type="spellStart"/>
-      <w:r>
-        <w:rPr>
-          <w:lang w:val="en-GB"/>
-        </w:rPr>
-        <w:t>nam</w:t>
-      </w:r>
-      <w:proofErr w:type="spellEnd"/>
-      <w:r>
-        <w:rPr>
-          <w:lang w:val="en-GB"/>
-        </w:rPr>
-        <w:t xml:space="preserve"> u </w:t>
-      </w:r>
-      <w:proofErr w:type="spellStart"/>
-      <w:r>
-        <w:rPr>
-          <w:lang w:val="en-GB"/>
-        </w:rPr>
-        <w:t>biti</w:t>
-      </w:r>
-      <w:proofErr w:type="spellEnd"/>
-      <w:r>
-        <w:rPr>
-          <w:lang w:val="en-GB"/>
-        </w:rPr>
-        <w:t xml:space="preserve"> </w:t>
-      </w:r>
-      <w:proofErr w:type="spellStart"/>
-      <w:r>
-        <w:rPr>
-          <w:lang w:val="en-GB"/>
-        </w:rPr>
-        <w:t>daje</w:t>
-      </w:r>
-      <w:proofErr w:type="spellEnd"/>
-      <w:r>
-        <w:rPr>
-          <w:lang w:val="en-GB"/>
-        </w:rPr>
-        <w:t xml:space="preserve"> 64 </w:t>
-      </w:r>
-      <w:proofErr w:type="spellStart"/>
-      <w:r>
-        <w:rPr>
-          <w:lang w:val="en-GB"/>
-        </w:rPr>
-        <w:t>različite</w:t>
-      </w:r>
-      <w:proofErr w:type="spellEnd"/>
-      <w:r>
-        <w:rPr>
-          <w:lang w:val="en-GB"/>
-        </w:rPr>
-        <w:t xml:space="preserve"> </w:t>
-      </w:r>
-      <w:proofErr w:type="spellStart"/>
-      <w:r>
-        <w:rPr>
-          <w:lang w:val="en-GB"/>
-        </w:rPr>
-        <w:t>transformisane</w:t>
-      </w:r>
-      <w:proofErr w:type="spellEnd"/>
-      <w:r>
-        <w:rPr>
-          <w:lang w:val="en-GB"/>
-        </w:rPr>
-        <w:t xml:space="preserve"> </w:t>
-      </w:r>
-      <w:proofErr w:type="spellStart"/>
-      <w:r>
-        <w:rPr>
-          <w:lang w:val="en-GB"/>
-        </w:rPr>
-        <w:t>slike</w:t>
-      </w:r>
-      <w:proofErr w:type="spellEnd"/>
-      <w:r>
-        <w:rPr>
-          <w:lang w:val="en-GB"/>
-        </w:rPr>
-        <w:t xml:space="preserve">. </w:t>
-      </w:r>
-      <w:proofErr w:type="spellStart"/>
-      <w:r>
-        <w:rPr>
-          <w:lang w:val="en-GB"/>
-        </w:rPr>
-        <w:t>Cilj</w:t>
-      </w:r>
-      <w:proofErr w:type="spellEnd"/>
-      <w:r>
-        <w:rPr>
-          <w:lang w:val="en-GB"/>
-        </w:rPr>
-        <w:t xml:space="preserve"> </w:t>
-      </w:r>
-      <w:proofErr w:type="spellStart"/>
-      <w:r>
-        <w:rPr>
-          <w:lang w:val="en-GB"/>
-        </w:rPr>
-        <w:t>ovoga</w:t>
-      </w:r>
-      <w:proofErr w:type="spellEnd"/>
-      <w:r>
-        <w:rPr>
-          <w:lang w:val="en-GB"/>
-        </w:rPr>
-        <w:t xml:space="preserve"> </w:t>
-      </w:r>
-      <w:proofErr w:type="spellStart"/>
-      <w:r>
-        <w:rPr>
-          <w:lang w:val="en-GB"/>
-        </w:rPr>
-        <w:t>jeste</w:t>
-      </w:r>
-      <w:proofErr w:type="spellEnd"/>
-      <w:r>
-        <w:rPr>
-          <w:lang w:val="en-GB"/>
-        </w:rPr>
-        <w:t xml:space="preserve"> da </w:t>
-      </w:r>
-      <w:proofErr w:type="spellStart"/>
-      <w:r>
-        <w:rPr>
-          <w:lang w:val="en-GB"/>
-        </w:rPr>
-        <w:t>povećavanje</w:t>
-      </w:r>
-      <w:proofErr w:type="spellEnd"/>
-      <w:r>
-        <w:rPr>
-          <w:lang w:val="en-GB"/>
-        </w:rPr>
-        <w:t xml:space="preserve"> </w:t>
-      </w:r>
-      <w:proofErr w:type="spellStart"/>
-      <w:r>
-        <w:rPr>
-          <w:lang w:val="en-GB"/>
-        </w:rPr>
-        <w:t>broj</w:t>
-      </w:r>
-      <w:r>
-        <w:rPr>
-          <w:lang w:val="en-GB"/>
-        </w:rPr>
-        <w:t>a</w:t>
-      </w:r>
-      <w:proofErr w:type="spellEnd"/>
-      <w:r>
-        <w:rPr>
-          <w:lang w:val="en-GB"/>
-        </w:rPr>
-        <w:t xml:space="preserve"> </w:t>
-      </w:r>
-      <w:proofErr w:type="spellStart"/>
-      <w:r>
-        <w:rPr>
-          <w:lang w:val="en-GB"/>
-        </w:rPr>
-        <w:t>kernela</w:t>
-      </w:r>
-      <w:proofErr w:type="spellEnd"/>
-      <w:r>
-        <w:rPr>
-          <w:lang w:val="en-GB"/>
-        </w:rPr>
-        <w:t xml:space="preserve">, </w:t>
-      </w:r>
-      <w:proofErr w:type="spellStart"/>
-      <w:r>
-        <w:rPr>
-          <w:lang w:val="en-GB"/>
-        </w:rPr>
-        <w:t>samim</w:t>
-      </w:r>
-      <w:proofErr w:type="spellEnd"/>
-      <w:r>
-        <w:rPr>
-          <w:lang w:val="en-GB"/>
-        </w:rPr>
-        <w:t xml:space="preserve"> time </w:t>
-      </w:r>
-      <w:proofErr w:type="spellStart"/>
-      <w:r>
-        <w:rPr>
-          <w:lang w:val="en-GB"/>
-        </w:rPr>
-        <w:t>omogućavanje</w:t>
-      </w:r>
-      <w:proofErr w:type="spellEnd"/>
-      <w:r>
-        <w:rPr>
-          <w:lang w:val="en-GB"/>
-        </w:rPr>
-        <w:t xml:space="preserve"> </w:t>
-      </w:r>
-      <w:proofErr w:type="spellStart"/>
-      <w:r>
-        <w:rPr>
-          <w:lang w:val="en-GB"/>
-        </w:rPr>
-        <w:t>prepoznavanje</w:t>
-      </w:r>
-      <w:proofErr w:type="spellEnd"/>
-      <w:r>
-        <w:rPr>
-          <w:lang w:val="en-GB"/>
-        </w:rPr>
-        <w:t xml:space="preserve"> </w:t>
-      </w:r>
-      <w:proofErr w:type="spellStart"/>
-      <w:r>
-        <w:rPr>
-          <w:lang w:val="en-GB"/>
-        </w:rPr>
-        <w:t>više</w:t>
-      </w:r>
-      <w:proofErr w:type="spellEnd"/>
-      <w:r>
-        <w:rPr>
-          <w:lang w:val="en-GB"/>
-        </w:rPr>
-        <w:t xml:space="preserve"> </w:t>
-      </w:r>
-      <w:proofErr w:type="spellStart"/>
-      <w:r>
-        <w:rPr>
-          <w:lang w:val="en-GB"/>
-        </w:rPr>
-        <w:t>oblika</w:t>
-      </w:r>
-      <w:proofErr w:type="spellEnd"/>
-      <w:r>
-        <w:rPr>
-          <w:lang w:val="en-GB"/>
-        </w:rPr>
-        <w:t xml:space="preserve"> </w:t>
-      </w:r>
-      <w:proofErr w:type="spellStart"/>
-      <w:r>
-        <w:rPr>
-          <w:lang w:val="en-GB"/>
-        </w:rPr>
-        <w:t>recimo</w:t>
-      </w:r>
-      <w:proofErr w:type="spellEnd"/>
-      <w:r>
-        <w:rPr>
-          <w:lang w:val="en-GB"/>
-        </w:rPr>
-        <w:t xml:space="preserve"> </w:t>
-      </w:r>
-      <w:proofErr w:type="spellStart"/>
-      <w:r>
-        <w:rPr>
-          <w:lang w:val="en-GB"/>
-        </w:rPr>
-        <w:t>jedan</w:t>
-      </w:r>
-      <w:proofErr w:type="spellEnd"/>
-      <w:r>
-        <w:rPr>
-          <w:lang w:val="en-GB"/>
-        </w:rPr>
-        <w:t xml:space="preserve"> kernel </w:t>
-      </w:r>
-      <w:proofErr w:type="spellStart"/>
-      <w:r>
-        <w:rPr>
-          <w:lang w:val="en-GB"/>
-        </w:rPr>
-        <w:t>će</w:t>
-      </w:r>
-      <w:proofErr w:type="spellEnd"/>
-      <w:r>
-        <w:rPr>
-          <w:lang w:val="en-GB"/>
-        </w:rPr>
-        <w:t xml:space="preserve"> </w:t>
-      </w:r>
-      <w:proofErr w:type="spellStart"/>
-      <w:r>
-        <w:rPr>
-          <w:lang w:val="en-GB"/>
-        </w:rPr>
-        <w:t>tražiti</w:t>
-      </w:r>
-      <w:proofErr w:type="spellEnd"/>
-      <w:r>
-        <w:rPr>
-          <w:lang w:val="en-GB"/>
-        </w:rPr>
-        <w:t xml:space="preserve"> </w:t>
-      </w:r>
-      <w:proofErr w:type="spellStart"/>
-      <w:r>
-        <w:rPr>
-          <w:lang w:val="en-GB"/>
-        </w:rPr>
-        <w:t>vertikal</w:t>
-      </w:r>
-      <w:r>
-        <w:rPr>
-          <w:lang w:val="en-GB"/>
-        </w:rPr>
-        <w:t>ne</w:t>
-      </w:r>
-      <w:proofErr w:type="spellEnd"/>
-      <w:r>
-        <w:rPr>
-          <w:lang w:val="en-GB"/>
-        </w:rPr>
-        <w:t xml:space="preserve"> </w:t>
-      </w:r>
-      <w:proofErr w:type="spellStart"/>
-      <w:r>
-        <w:rPr>
-          <w:lang w:val="en-GB"/>
-        </w:rPr>
-        <w:t>linije</w:t>
-      </w:r>
-      <w:proofErr w:type="spellEnd"/>
-      <w:r>
-        <w:rPr>
-          <w:lang w:val="en-GB"/>
-        </w:rPr>
-        <w:t xml:space="preserve">, </w:t>
-      </w:r>
-      <w:proofErr w:type="spellStart"/>
-      <w:r>
-        <w:rPr>
-          <w:lang w:val="en-GB"/>
-        </w:rPr>
-        <w:t>drugi</w:t>
-      </w:r>
-      <w:proofErr w:type="spellEnd"/>
-      <w:r>
-        <w:rPr>
-          <w:lang w:val="en-GB"/>
-        </w:rPr>
-        <w:t xml:space="preserve"> </w:t>
-      </w:r>
-      <w:proofErr w:type="spellStart"/>
-      <w:r>
-        <w:rPr>
-          <w:lang w:val="en-GB"/>
-        </w:rPr>
-        <w:t>horizontalne</w:t>
-      </w:r>
-      <w:proofErr w:type="spellEnd"/>
-      <w:r>
-        <w:rPr>
-          <w:lang w:val="en-GB"/>
-        </w:rPr>
-        <w:t xml:space="preserve"> </w:t>
-      </w:r>
-      <w:proofErr w:type="spellStart"/>
-      <w:r>
-        <w:rPr>
-          <w:lang w:val="en-GB"/>
-        </w:rPr>
-        <w:t>linije</w:t>
-      </w:r>
-      <w:proofErr w:type="spellEnd"/>
-      <w:r>
-        <w:rPr>
-          <w:lang w:val="en-GB"/>
-        </w:rPr>
-        <w:t xml:space="preserve"> </w:t>
-      </w:r>
-      <w:proofErr w:type="spellStart"/>
-      <w:r>
-        <w:rPr>
-          <w:lang w:val="en-GB"/>
-        </w:rPr>
-        <w:t>te</w:t>
-      </w:r>
-      <w:proofErr w:type="spellEnd"/>
-      <w:r>
-        <w:rPr>
-          <w:lang w:val="en-GB"/>
-        </w:rPr>
-        <w:t xml:space="preserve"> </w:t>
-      </w:r>
-      <w:proofErr w:type="spellStart"/>
-      <w:r>
-        <w:rPr>
-          <w:lang w:val="en-GB"/>
-        </w:rPr>
-        <w:t>treći</w:t>
-      </w:r>
-      <w:proofErr w:type="spellEnd"/>
-      <w:r>
-        <w:rPr>
-          <w:lang w:val="en-GB"/>
-        </w:rPr>
-        <w:t xml:space="preserve"> </w:t>
-      </w:r>
-      <w:proofErr w:type="spellStart"/>
-      <w:r>
-        <w:rPr>
-          <w:lang w:val="en-GB"/>
-        </w:rPr>
-        <w:t>krugove</w:t>
-      </w:r>
-      <w:proofErr w:type="spellEnd"/>
-      <w:r>
-        <w:rPr>
-          <w:lang w:val="en-GB"/>
-        </w:rPr>
-        <w:t>.</w:t>
-      </w:r>
-    </w:p>
-    <w:p>
-      <w:pPr>
-        <w:rPr>
-          <w:lang w:val="en-GB"/>
-        </w:rPr>
-      </w:pPr>
-    </w:p>
+    <w:p/>
     <w:p>
       <w:pPr>
         <w:ind w:left="720" w:hanging="720"/>

</xml_diff>